<commit_message>
changed download link for JAR in FRE Readme
</commit_message>
<xml_diff>
--- a/Frontend/Abgabe 2/In_Crust_we_trust_Pizzaservice_Milestone2/Abagabe_2_Read-Me.docx
+++ b/Frontend/Abgabe 2/In_Crust_we_trust_Pizzaservice_Milestone2/Abagabe_2_Read-Me.docx
@@ -17,25 +17,61 @@
           <w:bCs/>
           <w:lang w:val="en-US"/>
         </w:rPr>
-        <w:t>In Crust we trust .- Pizzeria – Frontend</w:t>
-      </w:r>
-    </w:p>
-    <w:p>
-      <w:pPr>
-        <w:spacing w:after="0"/>
+        <w:t xml:space="preserve">In Crust we </w:t>
+      </w:r>
+      <w:proofErr w:type="gramStart"/>
+      <w:r>
         <w:rPr>
           <w:b/>
           <w:bCs/>
           <w:lang w:val="en-US"/>
         </w:rPr>
-      </w:pPr>
+        <w:t>trust .</w:t>
+      </w:r>
+      <w:proofErr w:type="gramEnd"/>
       <w:r>
         <w:rPr>
           <w:b/>
           <w:bCs/>
           <w:lang w:val="en-US"/>
         </w:rPr>
-        <w:t>Frontend – Abgabe 2 – READ ME</w:t>
+        <w:t>- Pizzeria – Frontend</w:t>
+      </w:r>
+    </w:p>
+    <w:p>
+      <w:pPr>
+        <w:spacing w:after="0"/>
+        <w:rPr>
+          <w:b/>
+          <w:bCs/>
+          <w:lang w:val="en-US"/>
+        </w:rPr>
+      </w:pPr>
+      <w:r>
+        <w:rPr>
+          <w:b/>
+          <w:bCs/>
+          <w:lang w:val="en-US"/>
+        </w:rPr>
+        <w:t xml:space="preserve">Frontend – </w:t>
+      </w:r>
+      <w:proofErr w:type="spellStart"/>
+      <w:r>
+        <w:rPr>
+          <w:b/>
+          <w:bCs/>
+          <w:lang w:val="en-US"/>
+        </w:rPr>
+        <w:t>Abgabe</w:t>
+      </w:r>
+      <w:proofErr w:type="spellEnd"/>
+      <w:r>
+        <w:rPr>
+          <w:b/>
+          <w:bCs/>
+          <w:lang w:val="en-US"/>
+        </w:rPr>
+        <w:t xml:space="preserve"> 2 – READ ME</w:t>
       </w:r>
     </w:p>
     <w:p>
@@ -102,7 +138,19 @@
           <w:rPr>
             <w:rStyle w:val="Hyperlink"/>
           </w:rPr>
-          <w:t>https://drive.google.com/file/d/1x3YdDpmzXkanyrUil0cOYMbDiOeE7c_B/view?usp=drive_link</w:t>
+          <w:t>https://drive.google.com/file/d/1x3YdDpmzXkanyrUil0cOYMbDiOeE7c_B/view?us</w:t>
+        </w:r>
+        <w:r>
+          <w:rPr>
+            <w:rStyle w:val="Hyperlink"/>
+          </w:rPr>
+          <w:t>p</w:t>
+        </w:r>
+        <w:r>
+          <w:rPr>
+            <w:rStyle w:val="Hyperlink"/>
+          </w:rPr>
+          <w:t>=sharing</w:t>
         </w:r>
       </w:hyperlink>
     </w:p>
@@ -111,7 +159,15 @@
         <w:spacing w:after="0"/>
       </w:pPr>
       <w:r>
-        <w:t>In den Ordner wechseln wo die Datei liegt – CMD öffnen</w:t>
+        <w:t xml:space="preserve">In den Ordner </w:t>
+      </w:r>
+      <w:proofErr w:type="gramStart"/>
+      <w:r>
+        <w:t>wechseln</w:t>
+      </w:r>
+      <w:proofErr w:type="gramEnd"/>
+      <w:r>
+        <w:t xml:space="preserve"> wo die Datei liegt – CMD öffnen</w:t>
       </w:r>
     </w:p>
     <w:p>
@@ -171,7 +227,15 @@
         <w:spacing w:after="0"/>
       </w:pPr>
       <w:r>
-        <w:t>Start immer direkt aus der IDE (Webstorm) – index.html</w:t>
+        <w:t>Start immer direkt aus der IDE (</w:t>
+      </w:r>
+      <w:proofErr w:type="spellStart"/>
+      <w:r>
+        <w:t>Webstorm</w:t>
+      </w:r>
+      <w:proofErr w:type="spellEnd"/>
+      <w:r>
+        <w:t>) – index.html</w:t>
       </w:r>
     </w:p>
     <w:p>
@@ -200,7 +264,15 @@
         <w:spacing w:after="0"/>
       </w:pPr>
       <w:r>
-        <w:t>LOGIN – ist mit dem Backend verbunden – relevante Daten werden im LocalSTorage gespeichert</w:t>
+        <w:t xml:space="preserve">LOGIN – ist mit dem Backend verbunden – relevante Daten werden im </w:t>
+      </w:r>
+      <w:proofErr w:type="spellStart"/>
+      <w:r>
+        <w:t>LocalSTorage</w:t>
+      </w:r>
+      <w:proofErr w:type="spellEnd"/>
+      <w:r>
+        <w:t xml:space="preserve"> gespeichert</w:t>
       </w:r>
     </w:p>
     <w:p>
@@ -216,15 +288,39 @@
         <w:spacing w:after="0"/>
       </w:pPr>
       <w:r>
-        <w:t>·         loganx / 1234 (Standarduser)</w:t>
-      </w:r>
-    </w:p>
-    <w:p>
-      <w:pPr>
-        <w:spacing w:after="0"/>
-      </w:pPr>
-      <w:r>
-        <w:t>·         peterb/ 1234 (admin)</w:t>
+        <w:t xml:space="preserve">·         </w:t>
+      </w:r>
+      <w:proofErr w:type="spellStart"/>
+      <w:r>
+        <w:t>loganx</w:t>
+      </w:r>
+      <w:proofErr w:type="spellEnd"/>
+      <w:r>
+        <w:t xml:space="preserve"> / 1234 (Standarduser)</w:t>
+      </w:r>
+    </w:p>
+    <w:p>
+      <w:pPr>
+        <w:spacing w:after="0"/>
+      </w:pPr>
+      <w:r>
+        <w:t xml:space="preserve">·         </w:t>
+      </w:r>
+      <w:proofErr w:type="spellStart"/>
+      <w:r>
+        <w:t>peterb</w:t>
+      </w:r>
+      <w:proofErr w:type="spellEnd"/>
+      <w:r>
+        <w:t>/ 1234 (</w:t>
+      </w:r>
+      <w:proofErr w:type="spellStart"/>
+      <w:r>
+        <w:t>admin</w:t>
+      </w:r>
+      <w:proofErr w:type="spellEnd"/>
+      <w:r>
+        <w:t>)</w:t>
       </w:r>
     </w:p>
     <w:p>
@@ -264,15 +360,52 @@
         <w:t>Die Sichtbarkeit der</w:t>
       </w:r>
       <w:r>
-        <w:t xml:space="preserve"> Elemente der Navbar wird anhand von Userrolen und der aktuellen Seite gesteuert.</w:t>
-      </w:r>
-    </w:p>
-    <w:p>
-      <w:pPr>
-        <w:spacing w:after="0"/>
-      </w:pPr>
-      <w:r>
-        <w:t>Bei einzelnen Seite (z.B orderlist.html) ist auch schon eingebaut, dass direkter Zugriff durch nicht berichtigte User über Eingabe in der Browserzeile gesperrt ist. Es erfolgt ein Rerouting auf menu.html</w:t>
+        <w:t xml:space="preserve"> Elemente der </w:t>
+      </w:r>
+      <w:proofErr w:type="spellStart"/>
+      <w:r>
+        <w:t>Navbar</w:t>
+      </w:r>
+      <w:proofErr w:type="spellEnd"/>
+      <w:r>
+        <w:t xml:space="preserve"> wird anhand von </w:t>
+      </w:r>
+      <w:proofErr w:type="spellStart"/>
+      <w:r>
+        <w:t>Userrolen</w:t>
+      </w:r>
+      <w:proofErr w:type="spellEnd"/>
+      <w:r>
+        <w:t xml:space="preserve"> und der aktuellen Seite gesteuert.</w:t>
+      </w:r>
+    </w:p>
+    <w:p>
+      <w:pPr>
+        <w:spacing w:after="0"/>
+      </w:pPr>
+      <w:proofErr w:type="gramStart"/>
+      <w:r>
+        <w:t>Bei einzelnen Seite</w:t>
+      </w:r>
+      <w:proofErr w:type="gramEnd"/>
+      <w:r>
+        <w:t xml:space="preserve"> (</w:t>
+      </w:r>
+      <w:proofErr w:type="spellStart"/>
+      <w:r>
+        <w:t>z.B</w:t>
+      </w:r>
+      <w:proofErr w:type="spellEnd"/>
+      <w:r>
+        <w:t xml:space="preserve"> orderlist.html) ist auch schon eingebaut, dass direkter Zugriff durch nicht berichtigte User über Eingabe in der Browserzeile gesperrt ist. Es erfolgt ein </w:t>
+      </w:r>
+      <w:proofErr w:type="spellStart"/>
+      <w:r>
+        <w:t>Rerouting</w:t>
+      </w:r>
+      <w:proofErr w:type="spellEnd"/>
+      <w:r>
+        <w:t xml:space="preserve"> auf menu.html</w:t>
       </w:r>
     </w:p>
     <w:p>
@@ -308,7 +441,23 @@
         <w:spacing w:after="0"/>
       </w:pPr>
       <w:r>
-        <w:t>Die Navigation über die Navbar ist fast vollständige (die Badges im Adminbereich für neue Produkte / neue User haben noch keine Funktion).</w:t>
+        <w:t xml:space="preserve">Die Navigation über die </w:t>
+      </w:r>
+      <w:proofErr w:type="spellStart"/>
+      <w:r>
+        <w:t>Navbar</w:t>
+      </w:r>
+      <w:proofErr w:type="spellEnd"/>
+      <w:r>
+        <w:t xml:space="preserve"> ist fast vollständige (die Badges im </w:t>
+      </w:r>
+      <w:proofErr w:type="spellStart"/>
+      <w:r>
+        <w:t>Adminbereich</w:t>
+      </w:r>
+      <w:proofErr w:type="spellEnd"/>
+      <w:r>
+        <w:t xml:space="preserve"> für neue Produkte / neue User haben noch keine Funktion).</w:t>
       </w:r>
     </w:p>
     <w:p>
@@ -340,26 +489,89 @@
         <w:t xml:space="preserve">Einzelne Seiten </w:t>
       </w:r>
       <w:r>
-        <w:t xml:space="preserve">können nicht annavigiert werden (modalprofilepicture, orderdetails, orders, productinformations, </w:t>
+        <w:t xml:space="preserve">können nicht </w:t>
+      </w:r>
+      <w:proofErr w:type="spellStart"/>
+      <w:r>
+        <w:t>annavigiert</w:t>
+      </w:r>
+      <w:proofErr w:type="spellEnd"/>
+      <w:r>
+        <w:t xml:space="preserve"> werden (</w:t>
+      </w:r>
+      <w:proofErr w:type="spellStart"/>
+      <w:r>
+        <w:t>modalprofilepicture</w:t>
+      </w:r>
+      <w:proofErr w:type="spellEnd"/>
+      <w:r>
+        <w:t xml:space="preserve">, </w:t>
+      </w:r>
+      <w:proofErr w:type="spellStart"/>
+      <w:r>
+        <w:t>orderdetails</w:t>
+      </w:r>
+      <w:proofErr w:type="spellEnd"/>
+      <w:r>
+        <w:t xml:space="preserve">, </w:t>
+      </w:r>
+      <w:proofErr w:type="spellStart"/>
+      <w:r>
+        <w:t>orders</w:t>
+      </w:r>
+      <w:proofErr w:type="spellEnd"/>
+      <w:r>
+        <w:t xml:space="preserve">, </w:t>
+      </w:r>
+      <w:proofErr w:type="spellStart"/>
+      <w:proofErr w:type="gramStart"/>
+      <w:r>
+        <w:t>productinformations</w:t>
+      </w:r>
+      <w:proofErr w:type="spellEnd"/>
+      <w:r>
+        <w:t xml:space="preserve">, </w:t>
       </w:r>
       <w:r>
         <w:t xml:space="preserve"> </w:t>
       </w:r>
-      <w:r>
-        <w:t>productinformationsAdmin). Sie sind als statische Seiten vorhanden und könne über die DIE oder direkt im Browser geöffnet werden.</w:t>
-      </w:r>
-    </w:p>
-    <w:p>
-      <w:pPr>
-        <w:spacing w:after="0"/>
-      </w:pPr>
-    </w:p>
-    <w:p>
-      <w:pPr>
-        <w:spacing w:after="0"/>
-      </w:pPr>
-      <w:r>
-        <w:t>Für orderlists und productlist werden die Daten aus dem Backende geladen – für alle anderen Seite noch nicht.</w:t>
+      <w:proofErr w:type="spellStart"/>
+      <w:r>
+        <w:t>productinformationsAdmin</w:t>
+      </w:r>
+      <w:proofErr w:type="spellEnd"/>
+      <w:proofErr w:type="gramEnd"/>
+      <w:r>
+        <w:t>). Sie sind als statische Seiten vorhanden und könne über die DIE oder direkt im Browser geöffnet werden.</w:t>
+      </w:r>
+    </w:p>
+    <w:p>
+      <w:pPr>
+        <w:spacing w:after="0"/>
+      </w:pPr>
+    </w:p>
+    <w:p>
+      <w:pPr>
+        <w:spacing w:after="0"/>
+      </w:pPr>
+      <w:r>
+        <w:t xml:space="preserve">Für </w:t>
+      </w:r>
+      <w:proofErr w:type="spellStart"/>
+      <w:r>
+        <w:t>orderlists</w:t>
+      </w:r>
+      <w:proofErr w:type="spellEnd"/>
+      <w:r>
+        <w:t xml:space="preserve"> und </w:t>
+      </w:r>
+      <w:proofErr w:type="spellStart"/>
+      <w:r>
+        <w:t>productlist</w:t>
+      </w:r>
+      <w:proofErr w:type="spellEnd"/>
+      <w:r>
+        <w:t xml:space="preserve"> werden die Daten aus dem Backende geladen – für alle anderen Seite noch nicht.</w:t>
       </w:r>
     </w:p>
     <w:p>
@@ -404,28 +616,49 @@
         <w:spacing w:after="0"/>
       </w:pPr>
       <w:r>
-        <w:t>Registrierung, Produkte (Admin), Checkout</w:t>
-      </w:r>
-    </w:p>
-    <w:p>
-      <w:pPr>
-        <w:spacing w:after="0"/>
-      </w:pPr>
-    </w:p>
-    <w:p>
-      <w:pPr>
-        <w:spacing w:after="0"/>
-      </w:pPr>
-      <w:r>
-        <w:t>Die Validierung erfolgt nicht über Standard-HTML sondern über Bootstrap.</w:t>
-      </w:r>
-    </w:p>
-    <w:p>
-      <w:pPr>
-        <w:spacing w:after="0"/>
-      </w:pPr>
-      <w:r>
-        <w:t>Sie ist zweistufig – Bei der ersten Eingabe wird erst nach dem Submit geprüft, danach bei jeder Eingabe in einem Formularfeld</w:t>
+        <w:t xml:space="preserve">Registrierung, Produkte (Admin), </w:t>
+      </w:r>
+      <w:proofErr w:type="spellStart"/>
+      <w:r>
+        <w:t>Checkout</w:t>
+      </w:r>
+      <w:proofErr w:type="spellEnd"/>
+    </w:p>
+    <w:p>
+      <w:pPr>
+        <w:spacing w:after="0"/>
+      </w:pPr>
+    </w:p>
+    <w:p>
+      <w:pPr>
+        <w:spacing w:after="0"/>
+      </w:pPr>
+      <w:r>
+        <w:t>Die Validierung erfolgt nicht über Standard-</w:t>
+      </w:r>
+      <w:proofErr w:type="gramStart"/>
+      <w:r>
+        <w:t>HTML</w:t>
+      </w:r>
+      <w:proofErr w:type="gramEnd"/>
+      <w:r>
+        <w:t xml:space="preserve"> sondern über Bootstrap.</w:t>
+      </w:r>
+    </w:p>
+    <w:p>
+      <w:pPr>
+        <w:spacing w:after="0"/>
+      </w:pPr>
+      <w:r>
+        <w:t xml:space="preserve">Sie ist zweistufig – Bei der ersten Eingabe wird erst nach dem </w:t>
+      </w:r>
+      <w:proofErr w:type="spellStart"/>
+      <w:r>
+        <w:t>Submit</w:t>
+      </w:r>
+      <w:proofErr w:type="spellEnd"/>
+      <w:r>
+        <w:t xml:space="preserve"> geprüft, danach bei jeder Eingabe in einem Formularfeld</w:t>
       </w:r>
     </w:p>
     <w:p>
@@ -436,7 +669,28 @@
         <w:t xml:space="preserve">Für die Validierung wurde </w:t>
       </w:r>
       <w:r>
-        <w:t>Hilfsdateien/-funktionen erstellt  (validation, formUI).</w:t>
+        <w:t xml:space="preserve">Hilfsdateien/-funktionen </w:t>
+      </w:r>
+      <w:proofErr w:type="gramStart"/>
+      <w:r>
+        <w:t>erstellt  (</w:t>
+      </w:r>
+      <w:proofErr w:type="spellStart"/>
+      <w:proofErr w:type="gramEnd"/>
+      <w:r>
+        <w:t>validation</w:t>
+      </w:r>
+      <w:proofErr w:type="spellEnd"/>
+      <w:r>
+        <w:t xml:space="preserve">, </w:t>
+      </w:r>
+      <w:proofErr w:type="spellStart"/>
+      <w:r>
+        <w:t>formUI</w:t>
+      </w:r>
+      <w:proofErr w:type="spellEnd"/>
+      <w:r>
+        <w:t>).</w:t>
       </w:r>
     </w:p>
     <w:sectPr>
@@ -1171,6 +1425,7 @@
   <w:style w:type="character" w:default="1" w:styleId="Absatz-Standardschriftart">
     <w:name w:val="Default Paragraph Font"/>
     <w:uiPriority w:val="1"/>
+    <w:semiHidden/>
     <w:unhideWhenUsed/>
   </w:style>
   <w:style w:type="table" w:default="1" w:styleId="NormaleTabelle">
@@ -1505,6 +1760,18 @@
     <w:rPr>
       <w:color w:val="605E5C"/>
       <w:shd w:val="clear" w:color="auto" w:fill="E1DFDD"/>
+    </w:rPr>
+  </w:style>
+  <w:style w:type="character" w:styleId="BesuchterLink">
+    <w:name w:val="FollowedHyperlink"/>
+    <w:basedOn w:val="Absatz-Standardschriftart"/>
+    <w:uiPriority w:val="99"/>
+    <w:semiHidden/>
+    <w:unhideWhenUsed/>
+    <w:rsid w:val="00896C9C"/>
+    <w:rPr>
+      <w:color w:val="96607D" w:themeColor="followedHyperlink"/>
+      <w:u w:val="single"/>
     </w:rPr>
   </w:style>
 </w:styles>

</xml_diff>